<commit_message>
updated to publication year and bibliographic details for Wang's work in U5
</commit_message>
<xml_diff>
--- a/docs/LDRS-667.docx
+++ b/docs/LDRS-667.docx
@@ -23,7 +23,7 @@
         <w:pStyle w:val="Date"/>
       </w:pPr>
       <w:r>
-        <w:t xml:space="preserve">Mar 18, 2026</w:t>
+        <w:t xml:space="preserve">Apr 23, 2026</w:t>
       </w:r>
     </w:p>
     <w:p>
@@ -17027,7 +17027,7 @@
         <w:t xml:space="preserve"> </w:t>
       </w:r>
       <w:r>
-        <w:t xml:space="preserve">(2017)</w:t>
+        <w:t xml:space="preserve">(2016)</w:t>
       </w:r>
       <w:r>
         <w:t xml:space="preserve"> </w:t>
@@ -17039,7 +17039,7 @@
         <w:t xml:space="preserve"> </w:t>
       </w:r>
       <w:r>
-        <w:t xml:space="preserve">(2017)</w:t>
+        <w:t xml:space="preserve">(2016)</w:t>
       </w:r>
       <w:r>
         <w:t xml:space="preserve">, eye contact and relaxed body language, engaging students, being professional and organized, and creating a hospitable learning environment all serve to create the conditions for student learning and engagement. As you’ll recall from LDRS 627, simply having a plan to host a discussion about a given topic is not sufficient; you need to carefully plan how you will engage learners in the discussion, draw out those who may not readily participate, create an environment where disagreement is valued and respectful, and ensure that the information shared is accurate. You will also strive to create an environment of inclusivity, where diverse viewpoints are valued and all students belong. For discussions, as with all other learning activities, preparation is required.</w:t>
@@ -17110,7 +17110,7 @@
         <w:t xml:space="preserve"> </w:t>
       </w:r>
       <w:r>
-        <w:t xml:space="preserve">(2017)</w:t>
+        <w:t xml:space="preserve">(2016)</w:t>
       </w:r>
       <w:r>
         <w:t xml:space="preserve">, Silberman and Biech</w:t>
@@ -33374,13 +33374,13 @@
       </w:r>
     </w:p>
     <w:bookmarkEnd w:id="129"/>
-    <w:bookmarkStart w:id="130" w:name="ref-Wang2017Theory"/>
+    <w:bookmarkStart w:id="130" w:name="ref-wangTheoryPracticeAdult2016"/>
     <w:p>
       <w:pPr>
         <w:pStyle w:val="Bibliography"/>
       </w:pPr>
       <w:r>
-        <w:t xml:space="preserve">Wang, V. C. X. (2017).</w:t>
+        <w:t xml:space="preserve">Wang, V. C. X. (2016).</w:t>
       </w:r>
       <w:r>
         <w:t xml:space="preserve"> </w:t>

</xml_diff>